<commit_message>
General Knowledge Topic 3: Current Affairs knowledge base (to Oct 2026)
26th/27th Amendments and the FCC, office holders, KP governor's rule,
economy (Survey 2025-26, Budget 2026-27, IMF), Marka-e-Haq and the IWT
awards, Afghanistan, defence pacts, Iran war mediation, Gaza, Ukraine,
US, UN and summits, new leaders, Nobel and other awards, sports, essay
outlines and an MCQ bank. Pakistan Studies: Makkah defence pact added.
README: GK build commands.

Co-Authored-By: Claude Opus 5.5 <noreply@anthropic.com>
Claude-Session: https://claude.ai/code/session_01PZdKh3553gFe14fsvC6suv
</commit_message>
<xml_diff>
--- a/General Knowledge/Topic 2 - Pakistan Studies/Topic 2 - Knowledge Base.docx
+++ b/General Knowledge/Topic 2 - Pakistan Studies/Topic 2 - Knowledge Base.docx
@@ -17890,7 +17890,40 @@
         <w:t xml:space="preserve">17 September 2025</w:t>
       </w:r>
       <w:r>
-        <w:t xml:space="preserve">, Riyadh) — aggression against one is aggression against both.</w:t>
+        <w:t xml:space="preserve">, Riyadh) — aggression against one is aggression against both; widened into the </w:t>
+      </w:r>
+      <w:r>
+        <w:rPr>
+          <w:b/>
+          <w:bCs/>
+          <w:color w:val="2E7D32"/>
+        </w:rPr>
+        <w:t xml:space="preserve">Makkah Joint Defence Agreement</w:t>
+      </w:r>
+      <w:r>
+        <w:t xml:space="preserve"> with </w:t>
+      </w:r>
+      <w:r>
+        <w:rPr>
+          <w:b/>
+          <w:bCs/>
+          <w:color w:val="2E7D32"/>
+        </w:rPr>
+        <w:t xml:space="preserve">Türkiye</w:t>
+      </w:r>
+      <w:r>
+        <w:t xml:space="preserve"> (</w:t>
+      </w:r>
+      <w:r>
+        <w:rPr>
+          <w:b/>
+          <w:bCs/>
+          <w:color w:val="2E7D32"/>
+        </w:rPr>
+        <w:t xml:space="preserve">7 August 2026</w:t>
+      </w:r>
+      <w:r>
+        <w:t xml:space="preserve">).</w:t>
       </w:r>
     </w:p>
     <w:p>

</xml_diff>